<commit_message>
Add sample-construction funnel (Table A1) to the appendix
Walks the reader from the broad hourly workforce to the eligible population:
137.2M wage-observed employed 16-64 -> 76.0M paid hourly -> 73.3M excluding
dependent children -> 15.9M earning below the $16.80 target. Reconciles with the
21.7% take-up denominator and flags the round-dollar target sensitivity. Also
addresses the methodology review's 'no sample-construction funnel' finding.

Co-Authored-By: Claude Opus 4.8 <noreply@anthropic.com>
</commit_message>
<xml_diff>
--- a/drafts/2026-07-09_combined-brief-and-appendix.docx
+++ b/drafts/2026-07-09_combined-brief-and-appendix.docx
@@ -4377,6 +4377,208 @@
       </w:r>
       <w:r>
         <w:t xml:space="preserve"> A worker is eligible if they are a paid-hourly employee ages 16 to 64 earning under $16.80, excluding dependent children under 19. That yields 15.88 million workers—21.7 percent of the 73.3 million paid-hourly workforce—receiving an average of $3,518 per year. These figures involve no behavioral modeling.</w:t>
+      </w:r>
+    </w:p>
+    <w:p>
+      <w:pPr>
+        <w:pStyle w:val="BodyText"/>
+      </w:pPr>
+      <w:r>
+        <w:t xml:space="preserve">Table A1 walks the sample down from the broad hourly workforce to the eligible population.</w:t>
+      </w:r>
+    </w:p>
+    <w:p>
+      <w:pPr>
+        <w:pStyle w:val="BodyText"/>
+      </w:pPr>
+      <w:r>
+        <w:rPr>
+          <w:b/>
+          <w:bCs/>
+        </w:rPr>
+        <w:t xml:space="preserve">Table A1. From the hourly workforce to the eligible population.</w:t>
+      </w:r>
+    </w:p>
+    <w:tbl>
+      <w:tblPr>
+        <w:tblStyle w:val="Table"/>
+        <w:tblW w:type="auto" w:w="0"/>
+        <w:tblLook w:firstRow="1" w:lastRow="0" w:firstColumn="0" w:lastColumn="0" w:noHBand="0" w:noVBand="0" w:val="0020"/>
+      </w:tblPr>
+      <w:tblGrid>
+        <w:gridCol w:w="3960"/>
+        <w:gridCol w:w="3960"/>
+      </w:tblGrid>
+      <w:tr>
+        <w:trPr>
+          <w:tblHeader w:val="on"/>
+        </w:trPr>
+        <w:tc>
+          <w:tcPr/>
+          <w:p>
+            <w:pPr>
+              <w:pStyle w:val="Compact"/>
+            </w:pPr>
+            <w:r>
+              <w:t xml:space="preserve">Step</w:t>
+            </w:r>
+          </w:p>
+        </w:tc>
+        <w:tc>
+          <w:tcPr/>
+          <w:p>
+            <w:pPr>
+              <w:pStyle w:val="Compact"/>
+            </w:pPr>
+            <w:r>
+              <w:t xml:space="preserve">Workers (millions)</w:t>
+            </w:r>
+          </w:p>
+        </w:tc>
+      </w:tr>
+      <w:tr>
+        <w:tc>
+          <w:tcPr/>
+          <w:p>
+            <w:pPr>
+              <w:pStyle w:val="Compact"/>
+            </w:pPr>
+            <w:r>
+              <w:t xml:space="preserve">Employed with an observed hourly wage, ages 16–64</w:t>
+            </w:r>
+          </w:p>
+        </w:tc>
+        <w:tc>
+          <w:tcPr/>
+          <w:p>
+            <w:pPr>
+              <w:pStyle w:val="Compact"/>
+            </w:pPr>
+            <w:r>
+              <w:t xml:space="preserve">137.2</w:t>
+            </w:r>
+          </w:p>
+        </w:tc>
+      </w:tr>
+      <w:tr>
+        <w:tc>
+          <w:tcPr/>
+          <w:p>
+            <w:pPr>
+              <w:pStyle w:val="Compact"/>
+            </w:pPr>
+            <w:r>
+              <w:t xml:space="preserve">Paid by the hour (excludes salaried workers)</w:t>
+            </w:r>
+          </w:p>
+        </w:tc>
+        <w:tc>
+          <w:tcPr/>
+          <w:p>
+            <w:pPr>
+              <w:pStyle w:val="Compact"/>
+            </w:pPr>
+            <w:r>
+              <w:t xml:space="preserve">76.0</w:t>
+            </w:r>
+          </w:p>
+        </w:tc>
+      </w:tr>
+      <w:tr>
+        <w:tc>
+          <w:tcPr/>
+          <w:p>
+            <w:pPr>
+              <w:pStyle w:val="Compact"/>
+            </w:pPr>
+            <w:r>
+              <w:t xml:space="preserve">Less dependent children under 19</w:t>
+            </w:r>
+          </w:p>
+        </w:tc>
+        <w:tc>
+          <w:tcPr/>
+          <w:p>
+            <w:pPr>
+              <w:pStyle w:val="Compact"/>
+            </w:pPr>
+            <w:r>
+              <w:t xml:space="preserve">73.3</w:t>
+            </w:r>
+          </w:p>
+        </w:tc>
+      </w:tr>
+      <w:tr>
+        <w:tc>
+          <w:tcPr/>
+          <w:p>
+            <w:pPr>
+              <w:pStyle w:val="Compact"/>
+            </w:pPr>
+            <w:r>
+              <w:t xml:space="preserve">Earning below the $16.80 target — </w:t>
+            </w:r>
+            <w:r>
+              <w:rPr>
+                <w:b/>
+                <w:bCs/>
+              </w:rPr>
+              <w:t xml:space="preserve">eligible</w:t>
+            </w:r>
+          </w:p>
+        </w:tc>
+        <w:tc>
+          <w:tcPr/>
+          <w:p>
+            <w:pPr>
+              <w:pStyle w:val="Compact"/>
+            </w:pPr>
+            <w:r>
+              <w:rPr>
+                <w:b/>
+                <w:bCs/>
+              </w:rPr>
+              <w:t xml:space="preserve">15.9</w:t>
+            </w:r>
+          </w:p>
+        </w:tc>
+      </w:tr>
+    </w:tbl>
+    <w:p>
+      <w:pPr>
+        <w:pStyle w:val="BodyText"/>
+      </w:pPr>
+      <w:r>
+        <w:rPr>
+          <w:i/>
+          <w:iCs/>
+        </w:rPr>
+        <w:t xml:space="preserve">Note: Each row is a period-average weighted headcount (</w:t>
+      </w:r>
+      <w:r>
+        <w:rPr>
+          <w:rStyle w:val="VerbatimChar"/>
+          <w:i/>
+          <w:iCs/>
+        </w:rPr>
+        <w:t xml:space="preserve">EARNWT</w:t>
+      </w:r>
+      <w:r>
+        <w:rPr>
+          <w:i/>
+          <w:iCs/>
+        </w:rPr>
+        <w:t xml:space="preserve">, averaged over the 12 monthly samples). The paid-hourly step removes salaried workers whose weekly pay implies an hourly-equivalent wage; the self-employed and workers without a measurable hourly wage are excluded throughout. The eligible population is 21.7 percent of the 73.3 million paid-hourly workforce (row 3). The $16.80 target is 80 percent of the $21.00 paid-hourly median; because reported hourly wages cluster on round-dollar values, the eligible count is sensitive to the exact target.</w:t>
+      </w:r>
+      <w:r>
+        <w:t xml:space="preserve"> </w:t>
+      </w:r>
+      <w:r>
+        <w:rPr>
+          <w:i/>
+          <w:iCs/>
+        </w:rPr>
+        <w:t xml:space="preserve">Source: Economic Innovation Group 80-80 wage subsidy simulation, 2026; Current Population Survey Outgoing Rotation Group, May 2025–May 2026, via IPUMS-CPS.</w:t>
       </w:r>
     </w:p>
     <w:p>

</xml_diff>

<commit_message>
Add Figure A1: hourly-earnings distribution with data-driven target line
- 02e writes hourly_wage_distribution.parquet (per-worker wage + period-average
  weight for the 73.3M paid-hourly workforce, the eligibility denominator).
- 05d gains figA1_wage_distribution(): a Tufte/EIG-styled weighted histogram
  (whole-dollar bins, gold below-target/eligible vs green at/above, no box,
  horizontal gridlines only, direct labels) with a vertical dashed line at the
  target wage READ FROM data/processed/org_target_wage.json (not hard-coded);
  wired into the 05d driver so run_all regenerates it.
- Integrated Figure A1 into the appendix eligibility section, after Table A1.
Below-target mass = 15.88M (21.7%), matching the eligible count.

Co-Authored-By: Claude Opus 4.8 <noreply@anthropic.com>
</commit_message>
<xml_diff>
--- a/drafts/2026-07-09_combined-brief-and-appendix.docx
+++ b/drafts/2026-07-09_combined-brief-and-appendix.docx
@@ -4203,7 +4203,7 @@
     </w:p>
     <w:bookmarkEnd w:id="80"/>
     <w:bookmarkEnd w:id="81"/>
-    <w:bookmarkStart w:id="94" w:name="X717284a1a4c1fa8afe89c48c7964876afd2e627"/>
+    <w:bookmarkStart w:id="97" w:name="X717284a1a4c1fa8afe89c48c7964876afd2e627"/>
     <w:p>
       <w:pPr>
         <w:pStyle w:val="Heading1"/>
@@ -4307,7 +4307,7 @@
         <w:t xml:space="preserve"> A small number of structural choices (functional forms, bounds, weights) that evidence informs but does not pin down. Each one is flagged, and each one has a sensitivity attached.</w:t>
       </w:r>
     </w:p>
-    <w:bookmarkStart w:id="82" w:name="the-data-foundation"/>
+    <w:bookmarkStart w:id="85" w:name="the-data-foundation"/>
     <w:p>
       <w:pPr>
         <w:pStyle w:val="Heading2"/>
@@ -4586,28 +4586,103 @@
         <w:pStyle w:val="BodyText"/>
       </w:pPr>
       <w:r>
+        <w:t xml:space="preserve">Figure A1 shows that same population as a distribution. Reported hourly wages heap on round-dollar values, and the $16.80 target sits on a dense stretch of the distribution—so the eligible count is sensitive to exactly where the target lands.</w:t>
+      </w:r>
+    </w:p>
+    <w:p>
+      <w:pPr>
+        <w:pStyle w:val="BodyText"/>
+      </w:pPr>
+      <w:r>
         <w:rPr>
           <w:b/>
           <w:bCs/>
         </w:rPr>
-        <w:t xml:space="preserve">Taxes and transfers.</w:t>
-      </w:r>
-      <w:r>
-        <w:t xml:space="preserve"> Every dollar of earnings and subsidy is run through pre-computed household net-income schedules from PolicyEngine-US (2026 policy year): federal and state income taxes, payroll taxes, EITC, Child Tax Credit, SNAP, Medicaid/CHIP, ACA premium tax credits, TANF, SSI, and smaller programs, keyed by family type and state. Net income includes the ACA and Medicaid values that PolicyEngine excludes by default. One deliberate design assumption runs through everything: </w:t>
-      </w:r>
+        <w:t xml:space="preserve">Figure A1. About one in five paid-hourly workers earn below the target.</w:t>
+      </w:r>
+    </w:p>
+    <w:p>
+      <w:pPr>
+        <w:pStyle w:val="CaptionedFigure"/>
+      </w:pPr>
+      <w:r>
+        <w:drawing>
+          <wp:inline>
+            <wp:extent cx="5334000" cy="2980764"/>
+            <wp:effectExtent b="0" l="0" r="0" t="0"/>
+            <wp:docPr descr="Distribution of hourly earnings among the paid-hourly workforce, with a dashed line marking the $16.80 target wage" title="" id="83" name="Picture"/>
+            <a:graphic>
+              <a:graphicData uri="http://schemas.openxmlformats.org/drawingml/2006/picture">
+                <pic:pic>
+                  <pic:nvPicPr>
+                    <pic:cNvPr descr="/Users/benjamin/Documents/GitHub/eig-wagesubsidy-policy-sim/output/figures/main/figA1_wage_distribution.png" id="84" name="Picture"/>
+                    <pic:cNvPicPr>
+                      <a:picLocks noChangeArrowheads="1" noChangeAspect="1"/>
+                    </pic:cNvPicPr>
+                  </pic:nvPicPr>
+                  <pic:blipFill>
+                    <a:blip r:embed="rId82"/>
+                    <a:stretch>
+                      <a:fillRect/>
+                    </a:stretch>
+                  </pic:blipFill>
+                  <pic:spPr bwMode="auto">
+                    <a:xfrm>
+                      <a:off x="0" y="0"/>
+                      <a:ext cx="5334000" cy="2980764"/>
+                    </a:xfrm>
+                    <a:prstGeom prst="rect">
+                      <a:avLst/>
+                    </a:prstGeom>
+                    <a:noFill/>
+                    <a:ln w="9525">
+                      <a:noFill/>
+                      <a:headEnd/>
+                      <a:tailEnd/>
+                    </a:ln>
+                  </pic:spPr>
+                </pic:pic>
+              </a:graphicData>
+            </a:graphic>
+          </wp:inline>
+        </w:drawing>
+      </w:r>
+    </w:p>
+    <w:p>
+      <w:pPr>
+        <w:pStyle w:val="ImageCaption"/>
+      </w:pPr>
+      <w:r>
+        <w:t xml:space="preserve">Distribution of hourly earnings among the paid-hourly workforce, with a dashed line marking the $16.80 target wage</w:t>
+      </w:r>
+    </w:p>
+    <w:p>
+      <w:pPr>
+        <w:pStyle w:val="BodyText"/>
+      </w:pPr>
       <w:r>
         <w:rPr>
           <w:b/>
           <w:bCs/>
         </w:rPr>
+        <w:t xml:space="preserve">Taxes and transfers.</w:t>
+      </w:r>
+      <w:r>
+        <w:t xml:space="preserve"> Every dollar of earnings and subsidy is run through pre-computed household net-income schedules from PolicyEngine-US (2026 policy year): federal and state income taxes, payroll taxes, EITC, Child Tax Credit, SNAP, Medicaid/CHIP, ACA premium tax credits, TANF, SSI, and smaller programs, keyed by family type and state. Net income includes the ACA and Medicaid values that PolicyEngine excludes by default. One deliberate design assumption runs through everything: </w:t>
+      </w:r>
+      <w:r>
+        <w:rPr>
+          <w:b/>
+          <w:bCs/>
+        </w:rPr>
         <w:t xml:space="preserve">the subsidy is modeled as taxable income that counts against means-tested benefit eligibility.</w:t>
       </w:r>
       <w:r>
         <w:t xml:space="preserve"> This is the conservative reading; if Congress excluded the subsidy from means-tests (as it does the EITC), net costs would rise and the benefit-cliff interactions in Section 7 would shrink. We chose the conservative treatment and report its consequences rather than assuming them away.</w:t>
       </w:r>
     </w:p>
-    <w:bookmarkEnd w:id="82"/>
-    <w:bookmarkStart w:id="83" w:name="two-behavioral-models-on-purpose"/>
+    <w:bookmarkEnd w:id="85"/>
+    <w:bookmarkStart w:id="86" w:name="two-behavioral-models-on-purpose"/>
     <w:p>
       <w:pPr>
         <w:pStyle w:val="Heading2"/>
@@ -4680,8 +4755,8 @@
         <w:t xml:space="preserve">The two approaches land within a few billion dollars of each other on net cost ($45–48 billion), which is the strongest single robustness fact in the project. They differ on entry—the reduced-form benchmark of 0.48 million versus the structural model’s conservative floor of 1.02 million and evidence-central of 1.49 million—for reasons that are fully attributable: different populations (the benchmark scales up existing low-wage workers; the structural model draws from the actual non-employed), different stimulus definitions (gross versus net-of-transfer), and different response aggregation. We keep the benchmark untouched precisely so readers can see what the structural machinery changes.</w:t>
       </w:r>
     </w:p>
-    <w:bookmarkEnd w:id="83"/>
-    <w:bookmarkStart w:id="84" w:name="the-non-employed-pool-who-could-enter"/>
+    <w:bookmarkEnd w:id="86"/>
+    <w:bookmarkStart w:id="87" w:name="the-non-employed-pool-who-could-enter"/>
     <w:p>
       <w:pPr>
         <w:pStyle w:val="Heading2"/>
@@ -4897,8 +4972,8 @@
         <w:t xml:space="preserve">Roughly half of prime-age men out of the labor force report a serious health condition, and a quarter to a third receive disability benefits (Krueger 2017). A realistic wage-responsive entry pool is therefore closer to 10–15 million than 59 million—and the model’s mechanics respect that, in two ways described below (Sections 4 and 5).</w:t>
       </w:r>
     </w:p>
-    <w:bookmarkEnd w:id="84"/>
-    <w:bookmarkStart w:id="85" w:name="Xc30311955d704ab143defe3be9f8f8ba29d7033"/>
+    <w:bookmarkEnd w:id="87"/>
+    <w:bookmarkStart w:id="88" w:name="Xc30311955d704ab143defe3be9f8f8ba29d7033"/>
     <w:p>
       <w:pPr>
         <w:pStyle w:val="Heading2"/>
@@ -5100,8 +5175,8 @@
         <w:t xml:space="preserve"> is not.</w:t>
       </w:r>
     </w:p>
-    <w:bookmarkEnd w:id="85"/>
-    <w:bookmarkStart w:id="86" w:name="Xdca53244d57aed0d10cf2a8fea496674b7c19bf"/>
+    <w:bookmarkEnd w:id="88"/>
+    <w:bookmarkStart w:id="89" w:name="Xdca53244d57aed0d10cf2a8fea496674b7c19bf"/>
     <w:p>
       <w:pPr>
         <w:pStyle w:val="Heading2"/>
@@ -5640,8 +5715,8 @@
         <w:t xml:space="preserve"> Because no ready-made precedent exists, we discipline the output against the record instead. The closest macro-scale precedent—the 1990s EITC expansion, permanent and worth thousands per year, aimed at the most responsive population ever measured—raised single mothers’ employment about 3.5 to 4 percentage points over six years through the subsidy channel alone (Grogger 2003; Fang and Keane 2004). Scaled to our reachable pool, that is roughly 0.9 million entrants—just below our conservative floor of 1.02 million. Our evidence-central estimate (1.49 million) sits above that benchmark, between the Paycheck Plus demonstrations and SSP’s exceptional response, and the full range brackets Paycheck Plus Atlanta’s null on one end and approaches SSP-scale on the other. These effects also took years to build everywhere they were observed, so our figures are steady-state levels, not first-year impacts. Two further sensitivities, computed on the evidence-central pool: zeroing out entry by married people with employed spouses (a bound on household coordination, motivated by Bonin, Kempe, and Schneider 2003) moves it from 1.49 to 1.21 million; assuming 80 percent take-up (the EITC and SNAP range) moves it to 1.20 million.</w:t>
       </w:r>
     </w:p>
-    <w:bookmarkEnd w:id="86"/>
-    <w:bookmarkStart w:id="87" w:name="X93c46d2e2707a73d3fa34766fb275587773ec3b"/>
+    <w:bookmarkEnd w:id="89"/>
+    <w:bookmarkStart w:id="90" w:name="X93c46d2e2707a73d3fa34766fb275587773ec3b"/>
     <w:p>
       <w:pPr>
         <w:pStyle w:val="Heading2"/>
@@ -5703,8 +5778,8 @@
         <w:t xml:space="preserve"> of predicted wage roughly doubles entrant hours, full-time equivalents, and the marginal cost per job. The fiscal total is barely affected—entrants are a few billion dollars of a ~$56 billion gross—but the marginal-cost and FTE claims carry this sensitivity, so we report it rather than pick the favorable mapping silently.</w:t>
       </w:r>
     </w:p>
-    <w:bookmarkEnd w:id="87"/>
-    <w:bookmarkStart w:id="88" w:name="wages-incidence-and-the-safety-net"/>
+    <w:bookmarkEnd w:id="90"/>
+    <w:bookmarkStart w:id="91" w:name="wages-incidence-and-the-safety-net"/>
     <w:p>
       <w:pPr>
         <w:pStyle w:val="Heading2"/>
@@ -5758,8 +5833,8 @@
         <w:t xml:space="preserve"> Because the subsidy counts as income (Section 1), every entrant’s and worker’s gain is filtered through benefit phase-outs. Two headline consequences: the median single mother’s net return to working rises about 18 percent (versus roughly 27 percent for other women and 23 percent for men), and roughly one in eight of the entrants clear their threshold only because the model lets employers pay above the bargained wage across a benefit cliff. The cliffs are real features of the current safety net (main piece, Figures 11 and 11b), not artifacts; the modeling choice is that the subsidy is exposed to them.</w:t>
       </w:r>
     </w:p>
-    <w:bookmarkEnd w:id="88"/>
-    <w:bookmarkStart w:id="89" w:name="what-this-model-does-not-do"/>
+    <w:bookmarkEnd w:id="91"/>
+    <w:bookmarkStart w:id="92" w:name="what-this-model-does-not-do"/>
     <w:p>
       <w:pPr>
         <w:pStyle w:val="Heading2"/>
@@ -5902,8 +5977,8 @@
         <w:t xml:space="preserve"> (Section 4)—the wage-penalty band is the honest expression of what that leaves unknown.</w:t>
       </w:r>
     </w:p>
-    <w:bookmarkEnd w:id="89"/>
-    <w:bookmarkStart w:id="90" w:name="reading-the-uncertainty"/>
+    <w:bookmarkEnd w:id="92"/>
+    <w:bookmarkStart w:id="93" w:name="reading-the-uncertainty"/>
     <w:p>
       <w:pPr>
         <w:pStyle w:val="Heading2"/>
@@ -6148,8 +6223,8 @@
         </w:tc>
       </w:tr>
     </w:tbl>
-    <w:bookmarkEnd w:id="90"/>
-    <w:bookmarkStart w:id="91" w:name="reproducibility"/>
+    <w:bookmarkEnd w:id="93"/>
+    <w:bookmarkStart w:id="94" w:name="reproducibility"/>
     <w:p>
       <w:pPr>
         <w:pStyle w:val="Heading2"/>
@@ -6211,8 +6286,8 @@
         <w:t xml:space="preserve">), including the full revision history of the decisions described here.</w:t>
       </w:r>
     </w:p>
-    <w:bookmarkEnd w:id="91"/>
-    <w:bookmarkStart w:id="92" w:name="key-sources"/>
+    <w:bookmarkEnd w:id="94"/>
+    <w:bookmarkStart w:id="95" w:name="key-sources"/>
     <w:p>
       <w:pPr>
         <w:pStyle w:val="Heading2"/>
@@ -6321,8 +6396,8 @@
         </w:pict>
       </w:r>
     </w:p>
-    <w:bookmarkEnd w:id="92"/>
-    <w:bookmarkStart w:id="93" w:name="X739d645984154fb5e8aa1b2055c7b4d0ecf3e06"/>
+    <w:bookmarkEnd w:id="95"/>
+    <w:bookmarkStart w:id="96" w:name="X739d645984154fb5e8aa1b2055c7b4d0ecf3e06"/>
     <w:p>
       <w:pPr>
         <w:pStyle w:val="Heading2"/>
@@ -6411,8 +6486,8 @@
         <w:t xml:space="preserve"> figures quoted (evidence-central 1.49M [status-differentiated ~10% penalty, λ=0.75, central eps: sm 0.24 / ow 1.07 / men 0.18; entrant gross $7.8B / net $5.8B]; conservative floor 1.02M; high joint corner 3.81M; full grid 0.23–3.81M; $45–48B net; 47.8%/21.7% below-target; ρσ +0.11; λ=0.75 × group SDs 0.29–0.55; 18/27/23 evidence-central-pool clawback medians; hours band 0.06/0.19/0.28M incumbent FTE vs ~0.7M entry FTE; PI-3 entrant-hours sensitivity rank/independent/median on the evidence-central pool; Heckman survey-weighted primary [WTFINL probit / EARNWT wage OLS], unweighted robustness) are the 2026-07-09 re-centered values and must be regenerated together with the main draft if the pipeline changes. Citation formatting is author-date prose style; convert to EIG footnote format at publication if this appendix ships publicly.</w:t>
       </w:r>
     </w:p>
-    <w:bookmarkEnd w:id="93"/>
-    <w:bookmarkEnd w:id="94"/>
+    <w:bookmarkEnd w:id="96"/>
+    <w:bookmarkEnd w:id="97"/>
     <w:sectPr>
       <w:footnotePr>
         <w:numRestart w:val="eachSect"/>

</xml_diff>